<commit_message>
fixed font and shading
</commit_message>
<xml_diff>
--- a/docs/admin/overview.docx
+++ b/docs/admin/overview.docx
@@ -1530,7 +1530,7 @@
         <w:bottom w:color="FF0000" w:space="1" w:sz="8" w:val="single"/>
         <w:right w:color="FF0000" w:space="4" w:sz="8" w:val="single"/>
       </w:pBdr>
-      <w:shd w:color="auto" w:fill="auto" w:val="pct15"/>
+      <w:shd w:color="auto" w:fill="FBFBFB" w:val="clear"/>
       <w:spacing w:after="120" w:before="120"/>
       <w:ind w:left="432" w:right="432"/>
     </w:pPr>
@@ -1546,12 +1546,12 @@
     <w:rsid w:val="00771E03"/>
     <w:pPr>
       <w:pBdr>
-        <w:top w:color="auto" w:space="1" w:sz="8" w:val="single"/>
-        <w:left w:color="auto" w:space="4" w:sz="8" w:val="single"/>
-        <w:bottom w:color="auto" w:space="1" w:sz="8" w:val="single"/>
-        <w:right w:color="auto" w:space="4" w:sz="8" w:val="single"/>
+        <w:top w:color="BFBFBF" w:space="1" w:sz="6" w:val="single"/>
+        <w:left w:color="BFBFBF" w:space="4" w:sz="6" w:val="single"/>
+        <w:bottom w:color="BFBFBF" w:space="1" w:sz="6" w:val="single"/>
+        <w:right w:color="BFBFBF" w:space="4" w:sz="6" w:val="single"/>
       </w:pBdr>
-      <w:shd w:color="auto" w:fill="auto" w:val="pct15"/>
+      <w:shd w:color="auto" w:fill="FBFBFB" w:val="clear"/>
       <w:spacing w:after="240" w:before="240"/>
       <w:ind w:left="432" w:right="432"/>
     </w:pPr>
@@ -1566,7 +1566,13 @@
     <w:qFormat/>
     <w:rsid w:val="00771E03"/>
     <w:pPr>
-      <w:shd w:color="auto" w:fill="auto" w:val="pct15"/>
+      <w:pBdr>
+        <w:top w:color="BFBFBF" w:space="1" w:sz="6" w:val="single"/>
+        <w:left w:color="BFBFBF" w:space="4" w:sz="6" w:val="single"/>
+        <w:bottom w:color="BFBFBF" w:space="1" w:sz="6" w:val="single"/>
+        <w:right w:color="BFBFBF" w:space="4" w:sz="6" w:val="single"/>
+      </w:pBdr>
+      <w:shd w:color="auto" w:fill="FBFBFB" w:val="clear"/>
       <w:spacing w:after="240" w:before="240"/>
       <w:ind w:left="432" w:right="432"/>
     </w:pPr>

</xml_diff>